<commit_message>
Implementa mejoras para asesor, alumno y coordinador
</commit_message>
<xml_diff>
--- a/Proyecto-PracticasProfesionales-main-corregido/backend/templates/documentos/carta_exoneracion.docx
+++ b/Proyecto-PracticasProfesionales-main-corregido/backend/templates/documentos/carta_exoneracion.docx
@@ -70,7 +70,7 @@
           <w:vertAlign w:val="baseline"/>
           <w:rtl w:val="0"/>
         </w:rPr>
-        <w:t xml:space="preserve">FECHA</w:t>
+        <w:t>FECHA_DOCUMENTO</w:t>
       </w:r>
       <w:r>
         <w:rPr>
@@ -166,6 +166,212 @@
           <w:vertAlign w:val="baseline"/>
           <w:rtl w:val="0"/>
         </w:rPr>
+        <w:t>ACEPTO</w:t>
+      </w:r>
+      <w:r>
+        <w:rPr>
+          <w:rFonts w:ascii="Arial Narrow" w:cs="Arial Narrow" w:eastAsia="Arial Narrow" w:hAnsi="Arial Narrow"/>
+          <w:sz w:val="24"/>
+          <w:szCs w:val="24"/>
+          <w:vertAlign w:val="baseline"/>
+          <w:rtl w:val="0"/>
+        </w:rPr>
+        <w:t xml:space="preserve"> que la Facultad de Contaduría y Administración, C-I de la Universidad Autónoma de Chiapas solo es responsable con lo que establece la legislación universitaria en relación con el reglamento de prácticas profesionales, al realizar la </w:t>
+      </w:r>
+      <w:r>
+        <w:rPr>
+          <w:rFonts w:ascii="Arial Narrow" w:cs="Arial Narrow" w:eastAsia="Arial Narrow" w:hAnsi="Arial Narrow"/>
+          <w:b w:val="1"/>
+          <w:sz w:val="24"/>
+          <w:szCs w:val="24"/>
+          <w:u w:val="single"/>
+          <w:vertAlign w:val="baseline"/>
+          <w:rtl w:val="0"/>
+        </w:rPr>
+        <w:t>Práctica Profesional: ____________________.</w:t>
+      </w:r>
+      <w:r>
+        <w:rPr>
+          <w:rFonts w:ascii="Arial Narrow" w:cs="Arial Narrow" w:eastAsia="Arial Narrow" w:hAnsi="Arial Narrow"/>
+          <w:sz w:val="24"/>
+          <w:szCs w:val="24"/>
+          <w:vertAlign w:val="baseline"/>
+          <w:rtl w:val="0"/>
+        </w:rPr>
+        <w:t xml:space="preserve">, durante el periodo: del INICIO_DIA de </w:t>
+      </w:r>
+      <w:r>
+        <w:rPr>
+          <w:rFonts w:ascii="Arial Narrow" w:cs="Arial Narrow" w:eastAsia="Arial Narrow" w:hAnsi="Arial Narrow"/>
+          <w:b w:val="1"/>
+          <w:sz w:val="24"/>
+          <w:szCs w:val="24"/>
+          <w:u w:val="single"/>
+          <w:vertAlign w:val="baseline"/>
+          <w:rtl w:val="0"/>
+        </w:rPr>
+        <w:t>INICIO_MES</w:t>
+      </w:r>
+      <w:r>
+        <w:rPr>
+          <w:rFonts w:ascii="Arial Narrow" w:cs="Arial Narrow" w:eastAsia="Arial Narrow" w:hAnsi="Arial Narrow"/>
+          <w:sz w:val="24"/>
+          <w:szCs w:val="24"/>
+          <w:vertAlign w:val="baseline"/>
+          <w:rtl w:val="0"/>
+        </w:rPr>
+        <w:t xml:space="preserve"> de </w:t>
+      </w:r>
+      <w:r>
+        <w:rPr>
+          <w:rFonts w:ascii="Arial Narrow" w:cs="Arial Narrow" w:eastAsia="Arial Narrow" w:hAnsi="Arial Narrow"/>
+          <w:b w:val="1"/>
+          <w:sz w:val="24"/>
+          <w:szCs w:val="24"/>
+          <w:u w:val="single"/>
+          <w:vertAlign w:val="baseline"/>
+          <w:rtl w:val="0"/>
+        </w:rPr>
+        <w:t>INICIO_ANIO</w:t>
+      </w:r>
+      <w:r>
+        <w:rPr>
+          <w:rFonts w:ascii="Arial Narrow" w:cs="Arial Narrow" w:eastAsia="Arial Narrow" w:hAnsi="Arial Narrow"/>
+          <w:b w:val="1"/>
+          <w:sz w:val="24"/>
+          <w:szCs w:val="24"/>
+          <w:vertAlign w:val="baseline"/>
+          <w:rtl w:val="0"/>
+        </w:rPr>
+        <w:t xml:space="preserve"> al </w:t>
+      </w:r>
+      <w:r>
+        <w:rPr>
+          <w:rFonts w:ascii="Arial Narrow" w:cs="Arial Narrow" w:eastAsia="Arial Narrow" w:hAnsi="Arial Narrow"/>
+          <w:sz w:val="24"/>
+          <w:szCs w:val="24"/>
+          <w:vertAlign w:val="baseline"/>
+          <w:rtl w:val="0"/>
+        </w:rPr>
+        <w:t>FIN_DIA</w:t>
+      </w:r>
+      <w:r>
+        <w:rPr>
+          <w:rFonts w:ascii="Arial Narrow" w:cs="Arial Narrow" w:eastAsia="Arial Narrow" w:hAnsi="Arial Narrow"/>
+          <w:b w:val="1"/>
+          <w:sz w:val="24"/>
+          <w:szCs w:val="24"/>
+          <w:u w:val="single"/>
+          <w:vertAlign w:val="baseline"/>
+          <w:rtl w:val="0"/>
+        </w:rPr>
+        <w:t xml:space="preserve"> de </w:t>
+      </w:r>
+      <w:r>
+        <w:rPr>
+          <w:rFonts w:ascii="Arial Narrow" w:cs="Arial Narrow" w:eastAsia="Arial Narrow" w:hAnsi="Arial Narrow"/>
+          <w:sz w:val="24"/>
+          <w:szCs w:val="24"/>
+          <w:vertAlign w:val="baseline"/>
+          <w:rtl w:val="0"/>
+        </w:rPr>
+        <w:t>FIN_MES</w:t>
+      </w:r>
+      <w:r>
+        <w:rPr>
+          <w:rFonts w:ascii="Arial Narrow" w:cs="Arial Narrow" w:eastAsia="Arial Narrow" w:hAnsi="Arial Narrow"/>
+          <w:b w:val="1"/>
+          <w:sz w:val="24"/>
+          <w:szCs w:val="24"/>
+          <w:u w:val="single"/>
+          <w:vertAlign w:val="baseline"/>
+          <w:rtl w:val="0"/>
+        </w:rPr>
+        <w:t xml:space="preserve"> de </w:t>
+      </w:r>
+      <w:r>
+        <w:rPr>
+          <w:rFonts w:ascii="Arial Narrow" w:cs="Arial Narrow" w:eastAsia="Arial Narrow" w:hAnsi="Arial Narrow"/>
+          <w:sz w:val="24"/>
+          <w:szCs w:val="24"/>
+          <w:vertAlign w:val="baseline"/>
+          <w:rtl w:val="0"/>
+        </w:rPr>
+        <w:t>FIN_ANIO, en ____________, ____________.</w:t>
+      </w:r>
+    </w:p>
+    <w:p>
+      <w:pPr>
+        <w:jc w:val="both"/>
+        <w:rPr>
+          <w:rFonts w:ascii="Arial Narrow" w:cs="Arial Narrow" w:eastAsia="Arial Narrow" w:hAnsi="Arial Narrow"/>
+          <w:sz w:val="24"/>
+          <w:szCs w:val="24"/>
+          <w:vertAlign w:val="baseline"/>
+        </w:rPr>
+      </w:pPr>
+      <w:r>
+        <w:rPr>
+          <w:rFonts w:ascii="Arial Narrow" w:cs="Arial Narrow" w:eastAsia="Arial Narrow" w:hAnsi="Arial Narrow"/>
+          <w:sz w:val="24"/>
+          <w:szCs w:val="24"/>
+          <w:vertAlign w:val="baseline"/>
+          <w:rtl w:val="0"/>
+        </w:rPr>
+        <w:t xml:space="preserve">Estoy conforme que la Facultad de Contaduría y Administración, C-I de la Universidad Autónoma de Chiapas; no se obliga a cubrir mis gastos de enfermedad y accidente; toda vez, que me encuentro afiliado(a) con seguro facultativo de servicio médico proporcionado por el Instituto Mexicano del Seguro Social (IMSS), con número de afiliación: </w:t>
+      </w:r>
+      <w:r>
+        <w:rPr>
+          <w:rFonts w:ascii="Arial Narrow" w:cs="Arial Narrow" w:eastAsia="Arial Narrow" w:hAnsi="Arial Narrow"/>
+          <w:b w:val="1"/>
+          <w:sz w:val="24"/>
+          <w:szCs w:val="24"/>
+          <w:u w:val="single"/>
+          <w:vertAlign w:val="baseline"/>
+          <w:rtl w:val="0"/>
+        </w:rPr>
+        <w:t>_________________</w:t>
+      </w:r>
+      <w:r>
+        <w:rPr>
+          <w:rFonts w:ascii="Arial Narrow" w:cs="Arial Narrow" w:eastAsia="Arial Narrow" w:hAnsi="Arial Narrow"/>
+          <w:sz w:val="24"/>
+          <w:szCs w:val="24"/>
+          <w:vertAlign w:val="baseline"/>
+          <w:rtl w:val="0"/>
+        </w:rPr>
+        <w:t xml:space="preserve">.</w:t>
+      </w:r>
+    </w:p>
+    <w:p>
+      <w:pPr>
+        <w:jc w:val="both"/>
+        <w:rPr>
+          <w:rFonts w:ascii="Arial Narrow" w:cs="Arial Narrow" w:eastAsia="Arial Narrow" w:hAnsi="Arial Narrow"/>
+          <w:sz w:val="24"/>
+          <w:szCs w:val="24"/>
+          <w:vertAlign w:val="baseline"/>
+        </w:rPr>
+      </w:pPr>
+      <w:r>
+        <w:rPr>
+          <w:rFonts w:ascii="Arial Narrow" w:cs="Arial Narrow" w:eastAsia="Arial Narrow" w:hAnsi="Arial Narrow"/>
+          <w:sz w:val="24"/>
+          <w:szCs w:val="24"/>
+          <w:vertAlign w:val="baseline"/>
+          <w:rtl w:val="0"/>
+        </w:rPr>
+        <w:t xml:space="preserve">Me comprometo y </w:t>
+      </w:r>
+      <w:r>
+        <w:rPr>
+          <w:rFonts w:ascii="Arial Narrow" w:cs="Arial Narrow" w:eastAsia="Arial Narrow" w:hAnsi="Arial Narrow"/>
+          <w:b w:val="1"/>
+          <w:sz w:val="24"/>
+          <w:szCs w:val="24"/>
+          <w:vertAlign w:val="baseline"/>
+          <w:rtl w:val="0"/>
+        </w:rPr>
         <w:t xml:space="preserve">ACEPTO</w:t>
       </w:r>
       <w:r>
@@ -176,7 +382,28 @@
           <w:vertAlign w:val="baseline"/>
           <w:rtl w:val="0"/>
         </w:rPr>
-        <w:t xml:space="preserve"> que la Facultad de Contaduría y Administración, C-I de la Universidad Autónoma de Chiapas solo es responsable con lo que establece la legislación universitaria en relación con el reglamento de prácticas profesionales, al realizar la </w:t>
+        <w:t xml:space="preserve"> la responsabilidad del cuidado de mi persona, mis actos y a comportarme dentro de los valores de respeto. Así mismo, a cumplir con mis obligaciones de estudiante como lo establecen los lineamientos de la legislación universitaria, y en no dañar su imagen y prestigio.</w:t>
+      </w:r>
+    </w:p>
+    <w:p>
+      <w:pPr>
+        <w:jc w:val="both"/>
+        <w:rPr>
+          <w:rFonts w:ascii="Arial Narrow" w:cs="Arial Narrow" w:eastAsia="Arial Narrow" w:hAnsi="Arial Narrow"/>
+          <w:sz w:val="24"/>
+          <w:szCs w:val="24"/>
+          <w:vertAlign w:val="baseline"/>
+        </w:rPr>
+      </w:pPr>
+      <w:r>
+        <w:rPr>
+          <w:rFonts w:ascii="Arial Narrow" w:cs="Arial Narrow" w:eastAsia="Arial Narrow" w:hAnsi="Arial Narrow"/>
+          <w:sz w:val="24"/>
+          <w:szCs w:val="24"/>
+          <w:vertAlign w:val="baseline"/>
+          <w:rtl w:val="0"/>
+        </w:rPr>
+        <w:t xml:space="preserve">En caso de emergencia, favor de comunicarse al tel. </w:t>
       </w:r>
       <w:r>
         <w:rPr>
@@ -188,17 +415,17 @@
           <w:vertAlign w:val="baseline"/>
           <w:rtl w:val="0"/>
         </w:rPr>
-        <w:t xml:space="preserve">Práctica Profesional:   .</w:t>
-      </w:r>
-      <w:r>
-        <w:rPr>
-          <w:rFonts w:ascii="Arial Narrow" w:cs="Arial Narrow" w:eastAsia="Arial Narrow" w:hAnsi="Arial Narrow"/>
-          <w:sz w:val="24"/>
-          <w:szCs w:val="24"/>
-          <w:vertAlign w:val="baseline"/>
-          <w:rtl w:val="0"/>
-        </w:rPr>
-        <w:t xml:space="preserve">, durante el periodo: del __ de </w:t>
+        <w:t>(____) ______________</w:t>
+      </w:r>
+      <w:r>
+        <w:rPr>
+          <w:rFonts w:ascii="Arial Narrow" w:cs="Arial Narrow" w:eastAsia="Arial Narrow" w:hAnsi="Arial Narrow"/>
+          <w:sz w:val="24"/>
+          <w:szCs w:val="24"/>
+          <w:vertAlign w:val="baseline"/>
+          <w:rtl w:val="0"/>
+        </w:rPr>
+        <w:t xml:space="preserve">, con </w:t>
       </w:r>
       <w:r>
         <w:rPr>
@@ -210,17 +437,17 @@
           <w:vertAlign w:val="baseline"/>
           <w:rtl w:val="0"/>
         </w:rPr>
-        <w:t xml:space="preserve">_____</w:t>
-      </w:r>
-      <w:r>
-        <w:rPr>
-          <w:rFonts w:ascii="Arial Narrow" w:cs="Arial Narrow" w:eastAsia="Arial Narrow" w:hAnsi="Arial Narrow"/>
-          <w:sz w:val="24"/>
-          <w:szCs w:val="24"/>
-          <w:vertAlign w:val="baseline"/>
-          <w:rtl w:val="0"/>
-        </w:rPr>
-        <w:t xml:space="preserve"> de </w:t>
+        <w:t>________________________________________</w:t>
+      </w:r>
+      <w:r>
+        <w:rPr>
+          <w:rFonts w:ascii="Arial Narrow" w:cs="Arial Narrow" w:eastAsia="Arial Narrow" w:hAnsi="Arial Narrow"/>
+          <w:sz w:val="24"/>
+          <w:szCs w:val="24"/>
+          <w:vertAlign w:val="baseline"/>
+          <w:rtl w:val="0"/>
+        </w:rPr>
+        <w:t xml:space="preserve">; parentesco: </w:t>
       </w:r>
       <w:r>
         <w:rPr>
@@ -232,234 +459,7 @@
           <w:vertAlign w:val="baseline"/>
           <w:rtl w:val="0"/>
         </w:rPr>
-        <w:t xml:space="preserve">_____</w:t>
-      </w:r>
-      <w:r>
-        <w:rPr>
-          <w:rFonts w:ascii="Arial Narrow" w:cs="Arial Narrow" w:eastAsia="Arial Narrow" w:hAnsi="Arial Narrow"/>
-          <w:b w:val="1"/>
-          <w:sz w:val="24"/>
-          <w:szCs w:val="24"/>
-          <w:vertAlign w:val="baseline"/>
-          <w:rtl w:val="0"/>
-        </w:rPr>
-        <w:t xml:space="preserve">,</w:t>
-      </w:r>
-      <w:r>
-        <w:rPr>
-          <w:rFonts w:ascii="Arial Narrow" w:cs="Arial Narrow" w:eastAsia="Arial Narrow" w:hAnsi="Arial Narrow"/>
-          <w:sz w:val="24"/>
-          <w:szCs w:val="24"/>
-          <w:vertAlign w:val="baseline"/>
-          <w:rtl w:val="0"/>
-        </w:rPr>
-        <w:t xml:space="preserve"> en </w:t>
-      </w:r>
-      <w:r>
-        <w:rPr>
-          <w:rFonts w:ascii="Arial Narrow" w:cs="Arial Narrow" w:eastAsia="Arial Narrow" w:hAnsi="Arial Narrow"/>
-          <w:b w:val="1"/>
-          <w:sz w:val="24"/>
-          <w:szCs w:val="24"/>
-          <w:u w:val="single"/>
-          <w:vertAlign w:val="baseline"/>
-          <w:rtl w:val="0"/>
-        </w:rPr>
-        <w:t xml:space="preserve">ciudad</w:t>
-      </w:r>
-      <w:r>
-        <w:rPr>
-          <w:rFonts w:ascii="Arial Narrow" w:cs="Arial Narrow" w:eastAsia="Arial Narrow" w:hAnsi="Arial Narrow"/>
-          <w:sz w:val="24"/>
-          <w:szCs w:val="24"/>
-          <w:vertAlign w:val="baseline"/>
-          <w:rtl w:val="0"/>
-        </w:rPr>
-        <w:t xml:space="preserve">, </w:t>
-      </w:r>
-      <w:r>
-        <w:rPr>
-          <w:rFonts w:ascii="Arial Narrow" w:cs="Arial Narrow" w:eastAsia="Arial Narrow" w:hAnsi="Arial Narrow"/>
-          <w:b w:val="1"/>
-          <w:sz w:val="24"/>
-          <w:szCs w:val="24"/>
-          <w:u w:val="single"/>
-          <w:vertAlign w:val="baseline"/>
-          <w:rtl w:val="0"/>
-        </w:rPr>
-        <w:t xml:space="preserve">estado</w:t>
-      </w:r>
-      <w:r>
-        <w:rPr>
-          <w:rFonts w:ascii="Arial Narrow" w:cs="Arial Narrow" w:eastAsia="Arial Narrow" w:hAnsi="Arial Narrow"/>
-          <w:sz w:val="24"/>
-          <w:szCs w:val="24"/>
-          <w:vertAlign w:val="baseline"/>
-          <w:rtl w:val="0"/>
-        </w:rPr>
-        <w:t xml:space="preserve">.</w:t>
-      </w:r>
-    </w:p>
-    <w:p>
-      <w:pPr>
-        <w:jc w:val="both"/>
-        <w:rPr>
-          <w:rFonts w:ascii="Arial Narrow" w:cs="Arial Narrow" w:eastAsia="Arial Narrow" w:hAnsi="Arial Narrow"/>
-          <w:sz w:val="24"/>
-          <w:szCs w:val="24"/>
-          <w:vertAlign w:val="baseline"/>
-        </w:rPr>
-      </w:pPr>
-      <w:r>
-        <w:rPr>
-          <w:rFonts w:ascii="Arial Narrow" w:cs="Arial Narrow" w:eastAsia="Arial Narrow" w:hAnsi="Arial Narrow"/>
-          <w:sz w:val="24"/>
-          <w:szCs w:val="24"/>
-          <w:vertAlign w:val="baseline"/>
-          <w:rtl w:val="0"/>
-        </w:rPr>
-        <w:t xml:space="preserve">Estoy conforme que la Facultad de Contaduría y Administración, C-I de la Universidad Autónoma de Chiapas; no se obliga a cubrir mis gastos de enfermedad y accidente; toda vez, que me encuentro afiliado(a) con seguro facultativo de servicio médico proporcionado por el Instituto Mexicano del Seguro Social (IMSS), con número de afiliación: </w:t>
-      </w:r>
-      <w:r>
-        <w:rPr>
-          <w:rFonts w:ascii="Arial Narrow" w:cs="Arial Narrow" w:eastAsia="Arial Narrow" w:hAnsi="Arial Narrow"/>
-          <w:b w:val="1"/>
-          <w:sz w:val="24"/>
-          <w:szCs w:val="24"/>
-          <w:u w:val="single"/>
-          <w:vertAlign w:val="baseline"/>
-          <w:rtl w:val="0"/>
-        </w:rPr>
-        <w:t xml:space="preserve">00000000000000000</w:t>
-      </w:r>
-      <w:r>
-        <w:rPr>
-          <w:rFonts w:ascii="Arial Narrow" w:cs="Arial Narrow" w:eastAsia="Arial Narrow" w:hAnsi="Arial Narrow"/>
-          <w:sz w:val="24"/>
-          <w:szCs w:val="24"/>
-          <w:vertAlign w:val="baseline"/>
-          <w:rtl w:val="0"/>
-        </w:rPr>
-        <w:t xml:space="preserve">.</w:t>
-      </w:r>
-    </w:p>
-    <w:p>
-      <w:pPr>
-        <w:jc w:val="both"/>
-        <w:rPr>
-          <w:rFonts w:ascii="Arial Narrow" w:cs="Arial Narrow" w:eastAsia="Arial Narrow" w:hAnsi="Arial Narrow"/>
-          <w:sz w:val="24"/>
-          <w:szCs w:val="24"/>
-          <w:vertAlign w:val="baseline"/>
-        </w:rPr>
-      </w:pPr>
-      <w:r>
-        <w:rPr>
-          <w:rFonts w:ascii="Arial Narrow" w:cs="Arial Narrow" w:eastAsia="Arial Narrow" w:hAnsi="Arial Narrow"/>
-          <w:sz w:val="24"/>
-          <w:szCs w:val="24"/>
-          <w:vertAlign w:val="baseline"/>
-          <w:rtl w:val="0"/>
-        </w:rPr>
-        <w:t xml:space="preserve">Me comprometo y </w:t>
-      </w:r>
-      <w:r>
-        <w:rPr>
-          <w:rFonts w:ascii="Arial Narrow" w:cs="Arial Narrow" w:eastAsia="Arial Narrow" w:hAnsi="Arial Narrow"/>
-          <w:b w:val="1"/>
-          <w:sz w:val="24"/>
-          <w:szCs w:val="24"/>
-          <w:vertAlign w:val="baseline"/>
-          <w:rtl w:val="0"/>
-        </w:rPr>
-        <w:t xml:space="preserve">ACEPTO</w:t>
-      </w:r>
-      <w:r>
-        <w:rPr>
-          <w:rFonts w:ascii="Arial Narrow" w:cs="Arial Narrow" w:eastAsia="Arial Narrow" w:hAnsi="Arial Narrow"/>
-          <w:sz w:val="24"/>
-          <w:szCs w:val="24"/>
-          <w:vertAlign w:val="baseline"/>
-          <w:rtl w:val="0"/>
-        </w:rPr>
-        <w:t xml:space="preserve"> la responsabilidad del cuidado de mi persona, mis actos y a comportarme dentro de los valores de respeto. Así mismo, a cumplir con mis obligaciones de estudiante como lo establecen los lineamientos de la legislación universitaria, y en no dañar su imagen y prestigio.</w:t>
-      </w:r>
-    </w:p>
-    <w:p>
-      <w:pPr>
-        <w:jc w:val="both"/>
-        <w:rPr>
-          <w:rFonts w:ascii="Arial Narrow" w:cs="Arial Narrow" w:eastAsia="Arial Narrow" w:hAnsi="Arial Narrow"/>
-          <w:sz w:val="24"/>
-          <w:szCs w:val="24"/>
-          <w:vertAlign w:val="baseline"/>
-        </w:rPr>
-      </w:pPr>
-      <w:r>
-        <w:rPr>
-          <w:rFonts w:ascii="Arial Narrow" w:cs="Arial Narrow" w:eastAsia="Arial Narrow" w:hAnsi="Arial Narrow"/>
-          <w:sz w:val="24"/>
-          <w:szCs w:val="24"/>
-          <w:vertAlign w:val="baseline"/>
-          <w:rtl w:val="0"/>
-        </w:rPr>
-        <w:t xml:space="preserve">En caso de emergencia, favor de comunicarse al tel. </w:t>
-      </w:r>
-      <w:r>
-        <w:rPr>
-          <w:rFonts w:ascii="Arial Narrow" w:cs="Arial Narrow" w:eastAsia="Arial Narrow" w:hAnsi="Arial Narrow"/>
-          <w:b w:val="1"/>
-          <w:sz w:val="24"/>
-          <w:szCs w:val="24"/>
-          <w:u w:val="single"/>
-          <w:vertAlign w:val="baseline"/>
-          <w:rtl w:val="0"/>
-        </w:rPr>
-        <w:t xml:space="preserve">(clave lada) número</w:t>
-      </w:r>
-      <w:r>
-        <w:rPr>
-          <w:rFonts w:ascii="Arial Narrow" w:cs="Arial Narrow" w:eastAsia="Arial Narrow" w:hAnsi="Arial Narrow"/>
-          <w:sz w:val="24"/>
-          <w:szCs w:val="24"/>
-          <w:vertAlign w:val="baseline"/>
-          <w:rtl w:val="0"/>
-        </w:rPr>
-        <w:t xml:space="preserve">, con </w:t>
-      </w:r>
-      <w:r>
-        <w:rPr>
-          <w:rFonts w:ascii="Arial Narrow" w:cs="Arial Narrow" w:eastAsia="Arial Narrow" w:hAnsi="Arial Narrow"/>
-          <w:b w:val="1"/>
-          <w:sz w:val="24"/>
-          <w:szCs w:val="24"/>
-          <w:u w:val="single"/>
-          <w:vertAlign w:val="baseline"/>
-          <w:rtl w:val="0"/>
-        </w:rPr>
-        <w:t xml:space="preserve">nombre apellido paterno apellido materno</w:t>
-      </w:r>
-      <w:r>
-        <w:rPr>
-          <w:rFonts w:ascii="Arial Narrow" w:cs="Arial Narrow" w:eastAsia="Arial Narrow" w:hAnsi="Arial Narrow"/>
-          <w:sz w:val="24"/>
-          <w:szCs w:val="24"/>
-          <w:vertAlign w:val="baseline"/>
-          <w:rtl w:val="0"/>
-        </w:rPr>
-        <w:t xml:space="preserve">; parentesco: </w:t>
-      </w:r>
-      <w:r>
-        <w:rPr>
-          <w:rFonts w:ascii="Arial Narrow" w:cs="Arial Narrow" w:eastAsia="Arial Narrow" w:hAnsi="Arial Narrow"/>
-          <w:b w:val="1"/>
-          <w:sz w:val="24"/>
-          <w:szCs w:val="24"/>
-          <w:u w:val="single"/>
-          <w:vertAlign w:val="baseline"/>
-          <w:rtl w:val="0"/>
-        </w:rPr>
-        <w:t xml:space="preserve">escribir</w:t>
+        <w:t>____________________</w:t>
       </w:r>
       <w:r>
         <w:rPr>
@@ -582,7 +582,7 @@
           <w:vertAlign w:val="baseline"/>
           <w:rtl w:val="0"/>
         </w:rPr>
-        <w:t xml:space="preserve">Nombre y firma del alumno</w:t>
+        <w:t>NOMBRE_ALUMNO</w:t>
       </w:r>
       <w:r>
         <w:rPr>

</xml_diff>